<commit_message>
Papers ZH: vanilla RoPE -> 朴素 RoPE (standard translation, unified)
</commit_message>
<xml_diff>
--- a/papers/论文B中文规范版-PhaseCompleteLadders.docx
+++ b/papers/论文B中文规范版-PhaseCompleteLadders.docx
@@ -3243,13 +3243,22 @@
         <w:t xml:space="preserve"> </w:t>
       </w:r>
       <w:r>
-        <w:t xml:space="preserve">³ rope </w:t>
-      </w:r>
-      <w:r>
-        <w:rPr>
-          <w:rFonts w:hint="eastAsia"/>
-        </w:rPr>
-        <w:t xml:space="preserve">裸绳为</w:t>
+        <w:t xml:space="preserve">³ </w:t>
+      </w:r>
+      <w:r>
+        <w:rPr>
+          <w:rFonts w:hint="eastAsia"/>
+        </w:rPr>
+        <w:t xml:space="preserve">朴素</w:t>
+      </w:r>
+      <w:r>
+        <w:t xml:space="preserve"> </w:t>
+      </w:r>
+      <w:r>
+        <w:rPr>
+          <w:rFonts w:hint="eastAsia"/>
+        </w:rPr>
+        <w:t xml:space="preserve">RoPE（vanilla）为</w:t>
       </w:r>
       <w:r>
         <w:t xml:space="preserve"> b32 </w:t>
@@ -5964,7 +5973,16 @@
               <w:rPr>
                 <w:rFonts w:hint="eastAsia"/>
               </w:rPr>
-              <w:t xml:space="preserve">rope（裸绳，b32</w:t>
+              <w:t xml:space="preserve">rope（朴素</w:t>
+            </w:r>
+            <w:r>
+              <w:t xml:space="preserve"> </w:t>
+            </w:r>
+            <w:r>
+              <w:rPr>
+                <w:rFonts w:hint="eastAsia"/>
+              </w:rPr>
+              <w:t xml:space="preserve">RoPE，b32</w:t>
             </w:r>
             <w:r>
               <w:t xml:space="preserve"> </w:t>

</xml_diff>

<commit_message>
Papers B: add 附录 C 常见问题与边界澄清 (Q1-Q5 verified Q&A)
</commit_message>
<xml_diff>
--- a/papers/论文B中文规范版-PhaseCompleteLadders.docx
+++ b/papers/论文B中文规范版-PhaseCompleteLadders.docx
@@ -2,7 +2,7 @@
 <file path=word/document.xml><?xml version="1.0" encoding="utf-8"?>
 <w:document xmlns:w="http://schemas.openxmlformats.org/wordprocessingml/2006/main" xmlns:m="http://schemas.openxmlformats.org/officeDocument/2006/math" xmlns:r="http://schemas.openxmlformats.org/officeDocument/2006/relationships" xmlns:o="urn:schemas-microsoft-com:office:office" xmlns:v="urn:schemas-microsoft-com:vml" xmlns:w10="urn:schemas-microsoft-com:office:word" xmlns:a="http://schemas.openxmlformats.org/drawingml/2006/main" xmlns:pic="http://schemas.openxmlformats.org/drawingml/2006/picture" xmlns:wp="http://schemas.openxmlformats.org/drawingml/2006/wordprocessingDrawing">
   <w:body>
-    <w:bookmarkStart w:id="38" w:name="相位截断频率阶梯可认证且外推稳健的位置编码"/>
+    <w:bookmarkStart w:id="39" w:name="相位截断频率阶梯可认证且外推稳健的位置编码"/>
     <w:p>
       <w:pPr>
         <w:pStyle w:val="Heading1"/>
@@ -12233,7 +12233,957 @@
       </w:r>
     </w:p>
     <w:bookmarkEnd w:id="37"/>
+    <w:bookmarkStart w:id="38" w:name="附录-c-常见问题与边界澄清"/>
+    <w:p>
+      <w:pPr>
+        <w:pStyle w:val="Heading2"/>
+      </w:pPr>
+      <w:r>
+        <w:rPr>
+          <w:rFonts w:hint="eastAsia"/>
+        </w:rPr>
+        <w:t xml:space="preserve">附录</w:t>
+      </w:r>
+      <w:r>
+        <w:t xml:space="preserve"> C </w:t>
+      </w:r>
+      <w:r>
+        <w:rPr>
+          <w:rFonts w:hint="eastAsia"/>
+        </w:rPr>
+        <w:t xml:space="preserve">常见问题与边界澄清</w:t>
+      </w:r>
+    </w:p>
+    <w:p>
+      <w:pPr>
+        <w:pStyle w:val="FirstParagraph"/>
+      </w:pPr>
+      <w:r>
+        <w:rPr>
+          <w:rFonts w:hint="eastAsia"/>
+        </w:rPr>
+        <w:t xml:space="preserve">本节回答评审与读者最可能提出的五类边界问题；所有答案与正文</w:t>
+      </w:r>
+      <w:r>
+        <w:t xml:space="preserve"> §5.3、§7、§9 </w:t>
+      </w:r>
+      <w:r>
+        <w:rPr>
+          <w:rFonts w:hint="eastAsia"/>
+        </w:rPr>
+        <w:t xml:space="preserve">及配套论文</w:t>
+      </w:r>
+      <w:r>
+        <w:t xml:space="preserve"> A §5.3/§10 </w:t>
+      </w:r>
+      <w:r>
+        <w:rPr>
+          <w:rFonts w:hint="eastAsia"/>
+        </w:rPr>
+        <w:t xml:space="preserve">的口径一致，未引入正文之外的新主张。</w:t>
+      </w:r>
+    </w:p>
+    <w:p>
+      <w:pPr>
+        <w:pStyle w:val="BodyText"/>
+      </w:pPr>
+      <w:r>
+        <w:rPr>
+          <w:rFonts w:hint="eastAsia"/>
+          <w:b/>
+          <w:bCs/>
+        </w:rPr>
+        <w:t xml:space="preserve">Q1：</w:t>
+      </w:r>
+      <w:r>
+        <w:rPr>
+          <w:rStyle w:val="VerbatimChar"/>
+          <w:b/>
+          <w:bCs/>
+        </w:rPr>
+        <w:t xml:space="preserve">champion_e5_composite_certificate</w:t>
+      </w:r>
+      <w:r>
+        <w:rPr>
+          <w:b/>
+          <w:bCs/>
+        </w:rPr>
+        <w:t xml:space="preserve"> </w:t>
+      </w:r>
+      <w:r>
+        <w:rPr>
+          <w:rFonts w:hint="eastAsia"/>
+          <w:b/>
+          <w:bCs/>
+        </w:rPr>
+        <w:t xml:space="preserve">对剪掉</w:t>
+      </w:r>
+      <w:r>
+        <w:rPr>
+          <w:b/>
+          <w:bCs/>
+        </w:rPr>
+        <w:t xml:space="preserve"> 511 </w:t>
+      </w:r>
+      <w:r>
+        <w:rPr>
+          <w:rFonts w:hint="eastAsia"/>
+          <w:b/>
+          <w:bCs/>
+        </w:rPr>
+        <w:t xml:space="preserve">带后的</w:t>
+      </w:r>
+      <w:r>
+        <w:rPr>
+          <w:b/>
+          <w:bCs/>
+        </w:rPr>
+        <w:t xml:space="preserve"> 6 </w:t>
+      </w:r>
+      <w:r>
+        <w:rPr>
+          <w:rFonts w:hint="eastAsia"/>
+          <w:b/>
+          <w:bCs/>
+        </w:rPr>
+        <w:t xml:space="preserve">带版本是否成立？</w:t>
+      </w:r>
+    </w:p>
+    <w:p>
+      <w:pPr>
+        <w:pStyle w:val="BodyText"/>
+      </w:pPr>
+      <w:r>
+        <w:rPr>
+          <w:rFonts w:hint="eastAsia"/>
+        </w:rPr>
+        <w:t xml:space="preserve">答：未证明，且当前实证与证书范围一致。先厘清阶梯层级：8</w:t>
+      </w:r>
+      <w:r>
+        <w:t xml:space="preserve"> </w:t>
+      </w:r>
+      <w:r>
+        <w:rPr>
+          <w:rFonts w:hint="eastAsia"/>
+        </w:rPr>
+        <w:t xml:space="preserve">带全相位版</w:t>
+      </w:r>
+      <w:r>
+        <w:t xml:space="preserve"> [3,7,15,31,63,127,255,511] </w:t>
+      </w:r>
+      <w:r>
+        <w:rPr>
+          <w:rFonts w:hint="eastAsia"/>
+        </w:rPr>
+        <w:t xml:space="preserve">剪掉覆盖恰为</w:t>
+      </w:r>
+      <w:r>
+        <w:t xml:space="preserve"> 1.0 </w:t>
+      </w:r>
+      <w:r>
+        <w:rPr>
+          <w:rFonts w:hint="eastAsia"/>
+        </w:rPr>
+        <w:t xml:space="preserve">的</w:t>
+      </w:r>
+      <w:r>
+        <w:t xml:space="preserve"> 511 </w:t>
+      </w:r>
+      <w:r>
+        <w:rPr>
+          <w:rFonts w:hint="eastAsia"/>
+        </w:rPr>
+        <w:t xml:space="preserve">带得到</w:t>
+      </w:r>
+      <w:r>
+        <w:t xml:space="preserve"> E5’’ </w:t>
+      </w:r>
+      <w:r>
+        <w:rPr>
+          <w:rFonts w:hint="eastAsia"/>
+        </w:rPr>
+        <w:t xml:space="preserve">七带</w:t>
+      </w:r>
+      <w:r>
+        <w:t xml:space="preserve"> </w:t>
+      </w:r>
+      <w:r>
+        <w:rPr>
+          <w:rFonts w:hint="eastAsia"/>
+        </w:rPr>
+        <w:t xml:space="preserve">[3,7,15,31,63,127,255]（覆盖梯度主结果）；再剪</w:t>
+      </w:r>
+      <w:r>
+        <w:t xml:space="preserve"> 127 </w:t>
+      </w:r>
+      <w:r>
+        <w:rPr>
+          <w:rFonts w:hint="eastAsia"/>
+        </w:rPr>
+        <w:t xml:space="preserve">才是</w:t>
+      </w:r>
+      <w:r>
+        <w:t xml:space="preserve"> 6 </w:t>
+      </w:r>
+      <w:r>
+        <w:rPr>
+          <w:rFonts w:hint="eastAsia"/>
+        </w:rPr>
+        <w:t xml:space="preserve">带版。复合证书定理的语句为</w:t>
+      </w:r>
+      <w:r>
+        <w:t xml:space="preserve"> </w:t>
+      </w:r>
+      <w:r>
+        <w:rPr>
+          <w:rStyle w:val="VerbatimChar"/>
+        </w:rPr>
+        <w:t xml:space="preserve">length coeffs = 7 → (S − coh_e5) ≤ ‖F‖² ≤ (S + coh_e5)</w:t>
+      </w:r>
+      <w:r>
+        <w:rPr>
+          <w:rFonts w:hint="eastAsia"/>
+        </w:rPr>
+        <w:t xml:space="preserve">，其相干表是</w:t>
+      </w:r>
+      <w:r>
+        <w:t xml:space="preserve"> C(7,2)=21 </w:t>
+      </w:r>
+      <w:r>
+        <w:rPr>
+          <w:rFonts w:hint="eastAsia"/>
+        </w:rPr>
+        <w:t xml:space="preserve">对上三角</w:t>
+      </w:r>
+      <w:r>
+        <w:t xml:space="preserve"> δ </w:t>
+      </w:r>
+      <w:r>
+        <w:rPr>
+          <w:rFonts w:hint="eastAsia"/>
+        </w:rPr>
+        <w:t xml:space="preserve">界（</w:t>
+      </w:r>
+      <w:r>
+        <w:rPr>
+          <w:rStyle w:val="VerbatimChar"/>
+        </w:rPr>
+        <w:t xml:space="preserve">e5_bands</w:t>
+      </w:r>
+      <w:r>
+        <w:t xml:space="preserve"> </w:t>
+      </w:r>
+      <w:r>
+        <w:rPr>
+          <w:rFonts w:hint="eastAsia"/>
+        </w:rPr>
+        <w:t xml:space="preserve">硬编码），代码中无</w:t>
+      </w:r>
+      <w:r>
+        <w:t xml:space="preserve"> 6 </w:t>
+      </w:r>
+      <w:r>
+        <w:rPr>
+          <w:rFonts w:hint="eastAsia"/>
+        </w:rPr>
+        <w:t xml:space="preserve">带版本——需重新推导</w:t>
+      </w:r>
+      <w:r>
+        <w:t xml:space="preserve"> C(6,2)=15 </w:t>
+      </w:r>
+      <w:r>
+        <w:rPr>
+          <w:rFonts w:hint="eastAsia"/>
+        </w:rPr>
+        <w:t xml:space="preserve">对</w:t>
+      </w:r>
+      <w:r>
+        <w:t xml:space="preserve"> δ </w:t>
+      </w:r>
+      <w:r>
+        <w:rPr>
+          <w:rFonts w:hint="eastAsia"/>
+        </w:rPr>
+        <w:t xml:space="preserve">表并新建定理。实证侧亦无</w:t>
+      </w:r>
+      <w:r>
+        <w:t xml:space="preserve"> 6 </w:t>
+      </w:r>
+      <w:r>
+        <w:rPr>
+          <w:rFonts w:hint="eastAsia"/>
+        </w:rPr>
+        <w:t xml:space="preserve">带训练点。另：复合证书的装配机制本身是阶梯无关的——对任意给定阶梯，只需构造其对相干加权上界即可套用同一骨架（见</w:t>
+      </w:r>
+      <w:r>
+        <w:t xml:space="preserve"> Q3 </w:t>
+      </w:r>
+      <w:r>
+        <w:rPr>
+          <w:rFonts w:hint="eastAsia"/>
+        </w:rPr>
+        <w:t xml:space="preserve">及论文</w:t>
+      </w:r>
+      <w:r>
+        <w:t xml:space="preserve"> A </w:t>
+      </w:r>
+      <w:r>
+        <w:rPr>
+          <w:rFonts w:hint="eastAsia"/>
+        </w:rPr>
+        <w:t xml:space="preserve">§5.3）。</w:t>
+      </w:r>
+    </w:p>
+    <w:p>
+      <w:pPr>
+        <w:pStyle w:val="BodyText"/>
+      </w:pPr>
+      <w:r>
+        <w:rPr>
+          <w:rFonts w:hint="eastAsia"/>
+          <w:b/>
+          <w:bCs/>
+        </w:rPr>
+        <w:t xml:space="preserve">Q2：框架界</w:t>
+      </w:r>
+      <w:r>
+        <w:rPr>
+          <w:b/>
+          <w:bCs/>
+        </w:rPr>
+        <w:t xml:space="preserve"> </w:t>
+      </w:r>
+      <m:oMath>
+        <m:r>
+          <m:rPr>
+            <m:sty m:val="p"/>
+          </m:rPr>
+          <m:t>(</m:t>
+        </m:r>
+        <m:r>
+          <m:t>1</m:t>
+        </m:r>
+        <m:r>
+          <m:rPr>
+            <m:sty m:val="p"/>
+          </m:rPr>
+          <m:t>±</m:t>
+        </m:r>
+        <m:r>
+          <m:t>μ</m:t>
+        </m:r>
+        <m:r>
+          <m:rPr>
+            <m:sty m:val="p"/>
+          </m:rPr>
+          <m:t>)</m:t>
+        </m:r>
+        <m:r>
+          <m:t>S</m:t>
+        </m:r>
+      </m:oMath>
+      <w:r>
+        <w:rPr>
+          <w:b/>
+          <w:bCs/>
+        </w:rPr>
+        <w:t xml:space="preserve"> </w:t>
+      </w:r>
+      <w:r>
+        <w:rPr>
+          <w:rFonts w:hint="eastAsia"/>
+          <w:b/>
+          <w:bCs/>
+        </w:rPr>
+        <w:t xml:space="preserve">如何转化为</w:t>
+      </w:r>
+      <w:r>
+        <w:rPr>
+          <w:b/>
+          <w:bCs/>
+        </w:rPr>
+        <w:t xml:space="preserve"> PPL </w:t>
+      </w:r>
+      <w:r>
+        <w:rPr>
+          <w:rFonts w:hint="eastAsia"/>
+          <w:b/>
+          <w:bCs/>
+        </w:rPr>
+        <w:t xml:space="preserve">界？</w:t>
+      </w:r>
+    </w:p>
+    <w:p>
+      <w:pPr>
+        <w:pStyle w:val="BodyText"/>
+      </w:pPr>
+      <w:r>
+        <w:rPr>
+          <w:rFonts w:hint="eastAsia"/>
+        </w:rPr>
+        <w:t xml:space="preserve">答：没有直接转化。论文</w:t>
+      </w:r>
+      <w:r>
+        <w:t xml:space="preserve"> A </w:t>
+      </w:r>
+      <w:r>
+        <w:rPr>
+          <w:rFonts w:hint="eastAsia"/>
+        </w:rPr>
+        <w:t xml:space="preserve">含两类独立的机器证书：</w:t>
+      </w:r>
+      <w:r>
+        <w:rPr>
+          <w:rStyle w:val="VerbatimChar"/>
+        </w:rPr>
+        <w:t xml:space="preserve">certified_attention_approx</w:t>
+      </w:r>
+      <w:r>
+        <w:t xml:space="preserve"> </w:t>
+      </w:r>
+      <w:r>
+        <w:rPr>
+          <w:rFonts w:hint="eastAsia"/>
+        </w:rPr>
+        <w:t xml:space="preserve">对逐行丢弃谱能量</w:t>
+      </w:r>
+      <w:r>
+        <w:t xml:space="preserve"> ε </w:t>
+      </w:r>
+      <w:r>
+        <w:rPr>
+          <w:rFonts w:hint="eastAsia"/>
+        </w:rPr>
+        <w:t xml:space="preserve">给出注意力输出扰动界（涉及</w:t>
+      </w:r>
+      <w:r>
+        <w:t xml:space="preserve"> ε </w:t>
+      </w:r>
+      <w:r>
+        <w:rPr>
+          <w:rFonts w:hint="eastAsia"/>
+        </w:rPr>
+        <w:t xml:space="preserve">与注意力），而</w:t>
+      </w:r>
+      <w:r>
+        <w:t xml:space="preserve"> </w:t>
+      </w:r>
+      <w:r>
+        <w:rPr>
+          <w:rStyle w:val="VerbatimChar"/>
+        </w:rPr>
+        <w:t xml:space="preserve">champion_e5_composite_certificate</w:t>
+      </w:r>
+      <w:r>
+        <w:t xml:space="preserve"> </w:t>
+      </w:r>
+      <w:r>
+        <w:rPr>
+          <w:rFonts w:hint="eastAsia"/>
+        </w:rPr>
+        <w:t xml:space="preserve">是基表示稳定性界（不涉及</w:t>
+      </w:r>
+      <w:r>
+        <w:t xml:space="preserve"> ε </w:t>
+      </w:r>
+      <w:r>
+        <w:rPr>
+          <w:rFonts w:hint="eastAsia"/>
+        </w:rPr>
+        <w:t xml:space="preserve">或注意力）。</w:t>
+      </w:r>
+      <w:r>
+        <w:rPr>
+          <w:rFonts w:hint="eastAsia"/>
+        </w:rPr>
+        <w:t xml:space="preserve">“框架界</w:t>
+      </w:r>
+      <w:r>
+        <w:t xml:space="preserve"> → logits </w:t>
+      </w:r>
+      <w:r>
+        <w:rPr>
+          <w:rFonts w:hint="eastAsia"/>
+        </w:rPr>
+        <w:t xml:space="preserve">扰动</w:t>
+      </w:r>
+      <w:r>
+        <w:t xml:space="preserve"> → softmax </w:t>
+      </w:r>
+      <w:r>
+        <w:rPr>
+          <w:rFonts w:hint="eastAsia"/>
+        </w:rPr>
+        <w:t xml:space="preserve">输出</w:t>
+      </w:r>
+      <w:r>
+        <w:t xml:space="preserve"> → PPL”</w:t>
+      </w:r>
+      <w:r>
+        <w:t xml:space="preserve"> </w:t>
+      </w:r>
+      <w:r>
+        <w:rPr>
+          <w:rFonts w:hint="eastAsia"/>
+        </w:rPr>
+        <w:t xml:space="preserve">的跨层合成明确列为未来工作（论文</w:t>
+      </w:r>
+      <w:r>
+        <w:t xml:space="preserve"> A </w:t>
+      </w:r>
+      <w:r>
+        <w:rPr>
+          <w:rFonts w:hint="eastAsia"/>
+        </w:rPr>
+        <w:t xml:space="preserve">§10）。本文”带机器证书”的精确含义是表示层（基的平方范数/能量）有机器检查保证，而非端到端</w:t>
+      </w:r>
+      <w:r>
+        <w:t xml:space="preserve"> PPL </w:t>
+      </w:r>
+      <w:r>
+        <w:rPr>
+          <w:rFonts w:hint="eastAsia"/>
+        </w:rPr>
+        <w:t xml:space="preserve">上界。</w:t>
+      </w:r>
+    </w:p>
+    <w:p>
+      <w:pPr>
+        <w:pStyle w:val="BodyText"/>
+      </w:pPr>
+      <w:r>
+        <w:rPr>
+          <w:rFonts w:hint="eastAsia"/>
+          <w:b/>
+          <w:bCs/>
+        </w:rPr>
+        <w:t xml:space="preserve">Q3：psi-rope-rand</w:t>
+      </w:r>
+      <w:r>
+        <w:rPr>
+          <w:b/>
+          <w:bCs/>
+        </w:rPr>
+        <w:t xml:space="preserve"> </w:t>
+      </w:r>
+      <w:r>
+        <w:rPr>
+          <w:rFonts w:hint="eastAsia"/>
+          <w:b/>
+          <w:bCs/>
+        </w:rPr>
+        <w:t xml:space="preserve">的随机阶梯是否可能被</w:t>
+      </w:r>
+      <w:r>
+        <w:rPr>
+          <w:b/>
+          <w:bCs/>
+        </w:rPr>
+        <w:t xml:space="preserve"> </w:t>
+      </w:r>
+      <w:r>
+        <w:rPr>
+          <w:rStyle w:val="VerbatimChar"/>
+          <w:b/>
+          <w:bCs/>
+        </w:rPr>
+        <w:t xml:space="preserve">frame_check_instance</w:t>
+      </w:r>
+      <w:r>
+        <w:rPr>
+          <w:b/>
+          <w:bCs/>
+        </w:rPr>
+        <w:t xml:space="preserve"> </w:t>
+      </w:r>
+      <w:r>
+        <w:rPr>
+          <w:rFonts w:hint="eastAsia"/>
+          <w:b/>
+          <w:bCs/>
+        </w:rPr>
+        <w:t xml:space="preserve">通过？</w:t>
+      </w:r>
+    </w:p>
+    <w:p>
+      <w:pPr>
+        <w:pStyle w:val="BodyText"/>
+      </w:pPr>
+      <w:r>
+        <w:rPr>
+          <w:rFonts w:hint="eastAsia"/>
+        </w:rPr>
+        <w:t xml:space="preserve">答：个别样本可能通过，但不改变定位。系统扫描（114</w:t>
+      </w:r>
+      <w:r>
+        <w:t xml:space="preserve"> </w:t>
+      </w:r>
+      <w:r>
+        <w:rPr>
+          <w:rFonts w:hint="eastAsia"/>
+        </w:rPr>
+        <w:t xml:space="preserve">阶梯</w:t>
+      </w:r>
+      <w:r>
+        <w:t xml:space="preserve"> × 5 </w:t>
+      </w:r>
+      <w:r>
+        <w:rPr>
+          <w:rFonts w:hint="eastAsia"/>
+        </w:rPr>
+        <w:t xml:space="preserve">族）中</w:t>
+      </w:r>
+      <w:r>
+        <w:t xml:space="preserve"> E1 </w:t>
+      </w:r>
+      <w:r>
+        <w:rPr>
+          <w:rFonts w:hint="eastAsia"/>
+        </w:rPr>
+        <w:t xml:space="preserve">随机族</w:t>
+      </w:r>
+      <w:r>
+        <w:t xml:space="preserve"> 3/18 </w:t>
+      </w:r>
+      <w:r>
+        <w:rPr>
+          <w:rFonts w:hint="eastAsia"/>
+        </w:rPr>
+        <w:t xml:space="preserve">通过（16.7%），且该族多为真负（精确相干行和</w:t>
+      </w:r>
+      <w:r>
+        <w:t xml:space="preserve"> &gt; </w:t>
+      </w:r>
+      <w:r>
+        <w:rPr>
+          <w:rFonts w:hint="eastAsia"/>
+        </w:rPr>
+        <w:t xml:space="preserve">4/5）。即便某随机样本通过，检查器的健全性只保证该阶梯的基框架界（μ≤4/5），不保证任何外推</w:t>
+      </w:r>
+      <w:r>
+        <w:t xml:space="preserve"> PPL </w:t>
+      </w:r>
+      <w:r>
+        <w:rPr>
+          <w:rFonts w:hint="eastAsia"/>
+        </w:rPr>
+        <w:t xml:space="preserve">性质。本文对</w:t>
+      </w:r>
+      <w:r>
+        <w:t xml:space="preserve"> psi-rope-rand </w:t>
+      </w:r>
+      <w:r>
+        <w:rPr>
+          <w:rFonts w:hint="eastAsia"/>
+        </w:rPr>
+        <w:t xml:space="preserve">的定位是：其实证最优来自旋转角的稠密相位覆盖（128</w:t>
+      </w:r>
+      <w:r>
+        <w:t xml:space="preserve"> </w:t>
+      </w:r>
+      <w:r>
+        <w:rPr>
+          <w:rFonts w:hint="eastAsia"/>
+        </w:rPr>
+        <w:t xml:space="preserve">角铺满</w:t>
+      </w:r>
+      <w:r>
+        <w:t xml:space="preserve"> </w:t>
+      </w:r>
+      <w:r>
+        <w:rPr>
+          <w:rFonts w:hint="eastAsia"/>
+        </w:rPr>
+        <w:t xml:space="preserve">[3,511]），与几何基的框架判定正交；</w:t>
+      </w:r>
+      <w:r>
+        <w:rPr>
+          <w:rFonts w:hint="eastAsia"/>
+        </w:rPr>
+        <w:t xml:space="preserve">“随机阶梯在证书域外”</w:t>
+      </w:r>
+      <w:r>
+        <w:rPr>
+          <w:rFonts w:hint="eastAsia"/>
+        </w:rPr>
+        <w:t xml:space="preserve">指其在论文</w:t>
+      </w:r>
+      <w:r>
+        <w:t xml:space="preserve"> A </w:t>
+      </w:r>
+      <w:r>
+        <w:rPr>
+          <w:rFonts w:hint="eastAsia"/>
+        </w:rPr>
+        <w:t xml:space="preserve">形式化框架（稀疏增长/相干衰减/框架界）中无可证陈述，而非”检查器对每个随机样本都判否”。</w:t>
+      </w:r>
+    </w:p>
+    <w:p>
+      <w:pPr>
+        <w:pStyle w:val="BodyText"/>
+      </w:pPr>
+      <w:r>
+        <w:rPr>
+          <w:rFonts w:hint="eastAsia"/>
+          <w:b/>
+          <w:bCs/>
+        </w:rPr>
+        <w:t xml:space="preserve">Q4：酉不变性是否覆盖注意力</w:t>
+      </w:r>
+      <w:r>
+        <w:rPr>
+          <w:b/>
+          <w:bCs/>
+        </w:rPr>
+        <w:t xml:space="preserve"> </w:t>
+      </w:r>
+      <w:r>
+        <w:rPr>
+          <w:rFonts w:hint="eastAsia"/>
+          <w:b/>
+          <w:bCs/>
+        </w:rPr>
+        <w:t xml:space="preserve">logits？</w:t>
+      </w:r>
+    </w:p>
+    <w:p>
+      <w:pPr>
+        <w:pStyle w:val="BodyText"/>
+      </w:pPr>
+      <w:r>
+        <w:rPr>
+          <w:rFonts w:hint="eastAsia"/>
+        </w:rPr>
+        <w:t xml:space="preserve">答：否。论文</w:t>
+      </w:r>
+      <w:r>
+        <w:t xml:space="preserve"> A §5.3 </w:t>
+      </w:r>
+      <w:r>
+        <w:rPr>
+          <w:rFonts w:hint="eastAsia"/>
+        </w:rPr>
+        <w:t xml:space="preserve">明确限定：酉不变性证明适用于特征表示的范数层（基展开的平方范数/内积）；不保证学习到的</w:t>
+      </w:r>
+      <w:r>
+        <w:t xml:space="preserve"> Q/K </w:t>
+      </w:r>
+      <w:r>
+        <w:rPr>
+          <w:rFonts w:hint="eastAsia"/>
+        </w:rPr>
+        <w:t xml:space="preserve">投影下注意力</w:t>
+      </w:r>
+      <w:r>
+        <w:t xml:space="preserve"> logits </w:t>
+      </w:r>
+      <w:r>
+        <w:rPr>
+          <w:rFonts w:hint="eastAsia"/>
+        </w:rPr>
+        <w:t xml:space="preserve">在该旋转下不变，亦非旋转后注意力机制的证书。桥接限于”基函数的能量范数”层面。</w:t>
+      </w:r>
+    </w:p>
+    <w:p>
+      <w:pPr>
+        <w:pStyle w:val="BodyText"/>
+      </w:pPr>
+      <w:r>
+        <w:rPr>
+          <w:rFonts w:hint="eastAsia"/>
+          <w:b/>
+          <w:bCs/>
+        </w:rPr>
+        <w:t xml:space="preserve">Q5：论文</w:t>
+      </w:r>
+      <w:r>
+        <w:rPr>
+          <w:b/>
+          <w:bCs/>
+        </w:rPr>
+        <w:t xml:space="preserve"> A </w:t>
+      </w:r>
+      <w:r>
+        <w:rPr>
+          <w:rFonts w:hint="eastAsia"/>
+          <w:b/>
+          <w:bCs/>
+        </w:rPr>
+        <w:t xml:space="preserve">的证书是否”解释”了论文</w:t>
+      </w:r>
+      <w:r>
+        <w:rPr>
+          <w:b/>
+          <w:bCs/>
+        </w:rPr>
+        <w:t xml:space="preserve"> B </w:t>
+      </w:r>
+      <w:r>
+        <w:rPr>
+          <w:rFonts w:hint="eastAsia"/>
+          <w:b/>
+          <w:bCs/>
+        </w:rPr>
+        <w:t xml:space="preserve">的</w:t>
+      </w:r>
+      <w:r>
+        <w:rPr>
+          <w:b/>
+          <w:bCs/>
+        </w:rPr>
+        <w:t xml:space="preserve"> PPL </w:t>
+      </w:r>
+      <w:r>
+        <w:rPr>
+          <w:rFonts w:hint="eastAsia"/>
+          <w:b/>
+          <w:bCs/>
+        </w:rPr>
+        <w:t xml:space="preserve">改善？</w:t>
+      </w:r>
+    </w:p>
+    <w:p>
+      <w:pPr>
+        <w:pStyle w:val="BodyText"/>
+      </w:pPr>
+      <w:r>
+        <w:rPr>
+          <w:rFonts w:hint="eastAsia"/>
+        </w:rPr>
+        <w:t xml:space="preserve">答：否。论文</w:t>
+      </w:r>
+      <w:r>
+        <w:t xml:space="preserve"> A §5.3 </w:t>
+      </w:r>
+      <w:r>
+        <w:rPr>
+          <w:rFonts w:hint="eastAsia"/>
+        </w:rPr>
+        <w:t xml:space="preserve">与本文</w:t>
+      </w:r>
+      <w:r>
+        <w:t xml:space="preserve"> §6 </w:t>
+      </w:r>
+      <w:r>
+        <w:rPr>
+          <w:rFonts w:hint="eastAsia"/>
+        </w:rPr>
+        <w:t xml:space="preserve">同口径：</w:t>
+      </w:r>
+      <w:r>
+        <w:rPr>
+          <w:rStyle w:val="VerbatimChar"/>
+        </w:rPr>
+        <w:t xml:space="preserve">certified_attention_approx</w:t>
+      </w:r>
+      <w:r>
+        <w:t xml:space="preserve"> </w:t>
+      </w:r>
+      <w:r>
+        <w:rPr>
+          <w:rFonts w:hint="eastAsia"/>
+        </w:rPr>
+        <w:t xml:space="preserve">的输出界对谱能量</w:t>
+      </w:r>
+      <w:r>
+        <w:t xml:space="preserve"> ε </w:t>
+      </w:r>
+      <w:r>
+        <w:rPr>
+          <w:rFonts w:hint="eastAsia"/>
+        </w:rPr>
+        <w:t xml:space="preserve">单调，而剪掉</w:t>
+      </w:r>
+      <w:r>
+        <w:t xml:space="preserve"> 511 </w:t>
+      </w:r>
+      <w:r>
+        <w:rPr>
+          <w:rFonts w:hint="eastAsia"/>
+        </w:rPr>
+        <w:t xml:space="preserve">带的</w:t>
+      </w:r>
+      <w:r>
+        <w:t xml:space="preserve"> ε </w:t>
+      </w:r>
+      <w:r>
+        <w:rPr>
+          <w:rFonts w:hint="eastAsia"/>
+        </w:rPr>
+        <w:t xml:space="preserve">几乎不变、ppl</w:t>
+      </w:r>
+      <w:r>
+        <w:t xml:space="preserve"> </w:t>
+      </w:r>
+      <w:r>
+        <w:rPr>
+          <w:rFonts w:hint="eastAsia"/>
+        </w:rPr>
+        <w:t xml:space="preserve">却显著改善——增益机制不在当前形式化的谱能量通道内（候选：绝对相位混叠、softmax</w:t>
+      </w:r>
+      <w:r>
+        <w:t xml:space="preserve"> </w:t>
+      </w:r>
+      <w:r>
+        <w:rPr>
+          <w:rFonts w:hint="eastAsia"/>
+        </w:rPr>
+        <w:t xml:space="preserve">分母数值稳定性，均被现框架抽象掉）。论文</w:t>
+      </w:r>
+      <w:r>
+        <w:t xml:space="preserve"> A </w:t>
+      </w:r>
+      <w:r>
+        <w:rPr>
+          <w:rFonts w:hint="eastAsia"/>
+        </w:rPr>
+        <w:t xml:space="preserve">的机器可证内容止于”表示稳定性</w:t>
+      </w:r>
+      <w:r>
+        <w:t xml:space="preserve"> + </w:t>
+      </w:r>
+      <w:r>
+        <w:rPr>
+          <w:rFonts w:hint="eastAsia"/>
+        </w:rPr>
+        <w:t xml:space="preserve">能量有界”；从能量控制到外推</w:t>
+      </w:r>
+      <w:r>
+        <w:t xml:space="preserve"> PPL </w:t>
+      </w:r>
+      <w:r>
+        <w:rPr>
+          <w:rFonts w:hint="eastAsia"/>
+        </w:rPr>
+        <w:t xml:space="preserve">增益的桥梁依赖本文的覆盖梯度经验观察，未经形式化。两篇论文对此的边界表述一致（论文</w:t>
+      </w:r>
+      <w:r>
+        <w:t xml:space="preserve"> A §5.3</w:t>
+      </w:r>
+      <w:r>
+        <w:t xml:space="preserve"> </w:t>
+      </w:r>
+      <w:r>
+        <w:t xml:space="preserve">“What is not certified”</w:t>
+      </w:r>
+      <w:r>
+        <w:rPr>
+          <w:rFonts w:hint="eastAsia"/>
+        </w:rPr>
+        <w:t xml:space="preserve">、本文</w:t>
+      </w:r>
+      <w:r>
+        <w:t xml:space="preserve"> §6 </w:t>
+      </w:r>
+      <w:r>
+        <w:rPr>
+          <w:rFonts w:hint="eastAsia"/>
+        </w:rPr>
+        <w:t xml:space="preserve">经验规律声明）。</w:t>
+      </w:r>
+    </w:p>
     <w:bookmarkEnd w:id="38"/>
+    <w:bookmarkEnd w:id="39"/>
     <w:sectPr>
       <w:footnotePr>
         <w:numRestart w:val="eachSect"/>

</xml_diff>

<commit_message>
Papers B: correct FAQ Q3 (random ladders hold l2 linear-independence cert via psi_linear_independent; 'no frame-bound statement' not 'no provable statement'; note grid-angle route mu=0)
</commit_message>
<xml_diff>
--- a/papers/论文B中文规范版-PhaseCompleteLadders.docx
+++ b/papers/论文B中文规范版-PhaseCompleteLadders.docx
@@ -12867,16 +12867,72 @@
         <w:rPr>
           <w:rFonts w:hint="eastAsia"/>
         </w:rPr>
-        <w:t xml:space="preserve">性质。本文对</w:t>
-      </w:r>
-      <w:r>
-        <w:t xml:space="preserve"> psi-rope-rand </w:t>
-      </w:r>
-      <w:r>
-        <w:rPr>
-          <w:rFonts w:hint="eastAsia"/>
-        </w:rPr>
-        <w:t xml:space="preserve">的定位是：其实证最优来自旋转角的稠密相位覆盖（128</w:t>
+        <w:t xml:space="preserve">性质。</w:t>
+      </w:r>
+      <w:r>
+        <w:rPr>
+          <w:rFonts w:hint="eastAsia"/>
+          <w:b/>
+          <w:bCs/>
+        </w:rPr>
+        <w:t xml:space="preserve">表述修正</w:t>
+      </w:r>
+      <w:r>
+        <w:rPr>
+          <w:rFonts w:hint="eastAsia"/>
+        </w:rPr>
+        <w:t xml:space="preserve">：随机阶梯在论文</w:t>
+      </w:r>
+      <w:r>
+        <w:t xml:space="preserve"> A </w:t>
+      </w:r>
+      <w:r>
+        <w:rPr>
+          <w:rFonts w:hint="eastAsia"/>
+        </w:rPr>
+        <w:t xml:space="preserve">中的准确状态是”无框架界（μ≤4/5</w:t>
+      </w:r>
+      <w:r>
+        <w:t xml:space="preserve"> </w:t>
+      </w:r>
+      <w:r>
+        <w:rPr>
+          <w:rFonts w:hint="eastAsia"/>
+        </w:rPr>
+        <w:t xml:space="preserve">行和判定）陈述”——它持有</w:t>
+      </w:r>
+      <w:r>
+        <w:t xml:space="preserve"> ℓ² </w:t>
+      </w:r>
+      <w:r>
+        <w:rPr>
+          <w:rFonts w:hint="eastAsia"/>
+        </w:rPr>
+        <w:t xml:space="preserve">线性无关证书（</w:t>
+      </w:r>
+      <w:r>
+        <w:rPr>
+          <w:rStyle w:val="VerbatimChar"/>
+        </w:rPr>
+        <w:t xml:space="preserve">psi_linear_independent</w:t>
+      </w:r>
+      <w:r>
+        <w:t xml:space="preserve"> </w:t>
+      </w:r>
+      <w:r>
+        <w:rPr>
+          <w:rFonts w:hint="eastAsia"/>
+        </w:rPr>
+        <w:t xml:space="preserve">对任意</w:t>
+      </w:r>
+      <w:r>
+        <w:t xml:space="preserve"> NoDup </w:t>
+      </w:r>
+      <w:r>
+        <w:rPr>
+          <w:rFonts w:hint="eastAsia"/>
+        </w:rPr>
+        <w:t xml:space="preserve">阶梯成立），并非”无可证陈述”；其实证最优来自旋转角的稠密相位覆盖（128</w:t>
       </w:r>
       <w:r>
         <w:t xml:space="preserve"> </w:t>
@@ -12894,28 +12950,25 @@
         <w:rPr>
           <w:rFonts w:hint="eastAsia"/>
         </w:rPr>
-        <w:t xml:space="preserve">[3,511]），与几何基的框架判定正交；</w:t>
-      </w:r>
-      <w:r>
-        <w:rPr>
-          <w:rFonts w:hint="eastAsia"/>
-        </w:rPr>
-        <w:t xml:space="preserve">“随机阶梯在证书域外”</w:t>
-      </w:r>
-      <w:r>
-        <w:rPr>
-          <w:rFonts w:hint="eastAsia"/>
-        </w:rPr>
-        <w:t xml:space="preserve">指其在论文</w:t>
-      </w:r>
-      <w:r>
-        <w:t xml:space="preserve"> A </w:t>
-      </w:r>
-      <w:r>
-        <w:rPr>
-          <w:rFonts w:hint="eastAsia"/>
-        </w:rPr>
-        <w:t xml:space="preserve">形式化框架（稀疏增长/相干衰减/框架界）中无可证陈述，而非”检查器对每个随机样本都判否”。</w:t>
+        <w:t xml:space="preserve">[3,511]），与几何基的框架判定正交。另注：网格角度路线（θ_t</w:t>
+      </w:r>
+      <w:r>
+        <w:t xml:space="preserve"> = </w:t>
+      </w:r>
+      <w:r>
+        <w:rPr>
+          <w:rFonts w:hint="eastAsia"/>
+        </w:rPr>
+        <w:t xml:space="preserve">2πm_t/N，m_t</w:t>
+      </w:r>
+      <w:r>
+        <w:t xml:space="preserve"> </w:t>
+      </w:r>
+      <w:r>
+        <w:rPr>
+          <w:rFonts w:hint="eastAsia"/>
+        </w:rPr>
+        <w:t xml:space="preserve">互异）可对任意随机角度集给出精确正交证书（μ=0，于训练与所有被评估外推长度成立），列为后续工作方向。</w:t>
       </w:r>
     </w:p>
     <w:p>

</xml_diff>

<commit_message>
Paper B: 'significant' -> 'preliminary significant' with n=3 caveat (5-seed replication queued, preregistered) per reviewer feedback 3.3
</commit_message>
<xml_diff>
--- a/papers/论文B中文规范版-PhaseCompleteLadders.docx
+++ b/papers/论文B中文规范版-PhaseCompleteLadders.docx
@@ -8497,7 +8497,7 @@
           <w:i w:val="0"/>
           <w:sz w:val="24"/>
         </w:rPr>
-        <w:t>显著</w:t>
+        <w:t>初步显著</w:t>
       </w:r>
       <w:r>
         <w:rPr>
@@ -8506,7 +8506,7 @@
           <w:i w:val="0"/>
           <w:sz w:val="24"/>
         </w:rPr>
-        <w:t>；原降级对 C=4 vs NTK p=0.21 不显著）；小样本（n=3）df 局限如实标注，建议投稿前补 5 种子复核。</w:t>
+        <w:t>——n=3 小样本自由度极小，方向性结论；原降级对 C=4 vs NTK p=0.21 不显著）；小样本（n=3）df 局限如实标注，5 种子复核（9 方案 × {2026,31415}）已预登记并排队执行。</w:t>
       </w:r>
     </w:p>
     <w:p>
@@ -8576,7 +8576,7 @@
           <w:i w:val="0"/>
           <w:sz w:val="24"/>
         </w:rPr>
-        <w:t>旋转族内最优是随机稠密旋转角 psi-rope-rand @4096 = 6.45±0.03（3 个种子确认），击败 NTK-aware 测试时修复（11.54±1.18，3 个种子，p=0.018）</w:t>
+        <w:t>旋转族内最优是随机稠密旋转角 psi-rope-rand @4096 = 6.45±0.03（3 个种子确认），击败 NTK-aware 测试时修复（11.54±1.18，3 个种子，p=0.018，初步显著——n=3 小样本，5 种子复核已预登记并排队）</w:t>
       </w:r>
       <w:r>
         <w:rPr>

</xml_diff>

<commit_message>
M2 first theorem: CS-15 constructive four-atom layered certificate
New probe probe_c4_four_atom_cr.v (pure constructive track):
- Stdlib ConstructiveReals interface, Set-layer CRcarrier composition,
  zero classical axioms, zero Admitted - 5 Print Assumptions all Closed
- c4_four_atom_energy_stability: two-sided energy bound for the full
  4-atom ladder | ||sum c_j u_j||^2 - sum c_j^2 | <= mu_4 * 4 * sum c_j^2
  (CRrip_bound_k M=3 instantiation; energy stability needs no mu(M+1)<1)
- Q-layer window decisions: mu_4*4 = 45156/33920 > 1 (full-family
  uniqueness window CLOSED - precise obstacle) vs mu_4*3 = 33867/33920
  < 1 (3-atom subfamily window OPEN) - same constant, two directions
- c4_four_atom_layered_certificate: layered composition theorem
- Extracted c4_four_atom_cr.ml compiled via DkMLNative ocamlc (cmo ok)
- Paper B (spec + formal): CS-15 theorem-side note in conclusion
Turns the '4th atom uncovered' gap into a layered positive contribution.
</commit_message>
<xml_diff>
--- a/papers/论文B中文规范版-PhaseCompleteLadders.docx
+++ b/papers/论文B中文规范版-PhaseCompleteLadders.docx
@@ -1276,7 +1276,79 @@
           <w:i w:val="0"/>
           <w:sz w:val="24"/>
         </w:rPr>
-        <w:t xml:space="preserve">——ogrid 的恶化不来自跨对相干结构，与稠密覆盖主张一致）；τ/碰撞机制累计 </w:t>
+        <w:t>——ogrid 的恶化不来自跨对相干结构，与稠密覆盖主张一致）；</w:t>
+      </w:r>
+      <w:r>
+        <w:rPr>
+          <w:rFonts w:ascii="Times New Roman" w:hAnsi="Times New Roman" w:eastAsia="宋体"/>
+          <w:b w:val="0"/>
+          <w:i w:val="0"/>
+          <w:sz w:val="24"/>
+        </w:rPr>
+        <w:t>四原子分层证书定理侧（CS-15，</w:t>
+      </w:r>
+      <w:r>
+        <w:rPr>
+          <w:rFonts w:ascii="Consolas" w:hAnsi="Consolas" w:eastAsia="等线"/>
+          <w:b w:val="0"/>
+          <w:i w:val="0"/>
+          <w:sz w:val="22"/>
+        </w:rPr>
+        <w:t>probe_c4_four_atom_cr.v</w:t>
+      </w:r>
+      <w:r>
+        <w:rPr>
+          <w:rFonts w:ascii="Times New Roman" w:hAnsi="Times New Roman" w:eastAsia="宋体"/>
+          <w:b w:val="0"/>
+          <w:i w:val="0"/>
+          <w:sz w:val="24"/>
+        </w:rPr>
+        <w:t>，2026-08-30，纯构造性轨道：Stdlib ConstructiveReals 接口、Set 层 CRcarrier 组合、零经典公理、5 段 Print Assumptions 全 Closed、提取物 c4_four_atom_cr.ml 经 DkMLNative ocamlc 编译通过）</w:t>
+      </w:r>
+      <w:r>
+        <w:rPr>
+          <w:rFonts w:ascii="Times New Roman" w:hAnsi="Times New Roman" w:eastAsia="宋体"/>
+          <w:b/>
+          <w:i w:val="0"/>
+          <w:sz w:val="24"/>
+        </w:rPr>
+        <w:t>："第 4 原子 213 未覆盖"由此转化为分层正面贡献——</w:t>
+      </w:r>
+      <w:r>
+        <w:rPr>
+          <w:rFonts w:ascii="Times New Roman" w:hAnsi="Times New Roman" w:eastAsia="宋体"/>
+          <w:b w:val="0"/>
+          <w:i w:val="0"/>
+          <w:sz w:val="24"/>
+        </w:rPr>
+        <w:t>层 1（全族 4 原子）双侧能量稳定</w:t>
+      </w:r>
+      <w:r>
+        <w:rPr>
+          <w:rFonts w:ascii="Times New Roman" w:hAnsi="Times New Roman" w:eastAsia="宋体"/>
+          <w:b/>
+          <w:i w:val="0"/>
+          <w:sz w:val="24"/>
+        </w:rPr>
+        <w:t>：|‖Σ_{j≤3} c_j·u_j‖² − Σc_j²| ≤ μ₄·4·Σc_j²（`c4_four_atom_energy_stability`，CRrip_bound_k M=3 实例化——能量稳定不要求 μ(M+1)&lt;1）；</w:t>
+      </w:r>
+      <w:r>
+        <w:rPr>
+          <w:rFonts w:ascii="Times New Roman" w:hAnsi="Times New Roman" w:eastAsia="宋体"/>
+          <w:b w:val="0"/>
+          <w:i w:val="0"/>
+          <w:sz w:val="24"/>
+        </w:rPr>
+        <w:t>层 2（Q 层窗口判定）</w:t>
+      </w:r>
+      <w:r>
+        <w:rPr>
+          <w:rFonts w:ascii="Times New Roman" w:hAnsi="Times New Roman" w:eastAsia="宋体"/>
+          <w:b/>
+          <w:i w:val="0"/>
+          <w:sz w:val="24"/>
+        </w:rPr>
+        <w:t xml:space="preserve">：μ₄·4 = 45156/33920 &gt; 1（全族唯一性窗口关闭，精确障碍）而 μ₄·3 = 33867/33920 &lt; 1（3 原子子族窗口开启）——同一常数 μ₄ = 11289/33920 的两个方向判定（`c4_four_atom_layered_certificate` 合成）。τ/碰撞机制累计 </w:t>
       </w:r>
       <w:r>
         <w:rPr>

</xml_diff>

<commit_message>
M2 second theorem: CS-16 constructive safe-domain mirror consistency
probe_safe_domain.v: c4_safe_domain — C=4 denominator chain
[400;2080;3500;20800;33920] product 2054520832000000000 < 2^63 stays in the
safe domain; overflow-free implies mod-2^63 mirror == exact semantics;
membership decidable via extractable safe_domain_bool. 4 Print Assumptions
all Closed (zero axioms); safe_domain.ml/.mli compile under DkMLNative ocamlc.
Paper B: CS-16 sentence appended after CS-15 (master v2.10 revision note +
formal version, both docx regenerated).
</commit_message>
<xml_diff>
--- a/papers/论文B中文规范版-PhaseCompleteLadders.docx
+++ b/papers/论文B中文规范版-PhaseCompleteLadders.docx
@@ -59,7 +59,7 @@
           <w:color w:val="444444"/>
           <w:sz w:val="21"/>
         </w:rPr>
-        <w:t xml:space="preserve">版本：最终版 v2.9（2026-08-30）｜数据基线：2026-08-21 全量实证终态 + 2026-08-22 网格/τ 三剪判决（3 个种子确认 + E1 全部消融 + τ 机制 5 个正向判决）+ 2026-08-23 正式配置复现（tinystories200 · 27000 iters，云端 T4，τ 裁剪 τ-trimmed reallocation，τ 机制 7 个方向性正向判决 = 3 稳健支点 + 1 候选[v2.9 降格]）+ </w:t>
+        <w:t xml:space="preserve">版本：最终版 v2.10（2026-08-30）｜数据基线：2026-08-21 全量实证终态 + 2026-08-22 网格/τ 三剪判决（3 个种子确认 + E1 全部消融 + τ 机制 5 个正向判决）+ 2026-08-23 正式配置复现（tinystories200 · 27000 iters，云端 T4，τ 裁剪 τ-trimmed reallocation，τ 机制 7 个方向性正向判决 = 3 稳健支点 + 1 候选[v2.9 降格]）+ </w:t>
       </w:r>
       <w:r>
         <w:rPr>
@@ -1009,6 +1009,131 @@
     </w:p>
     <w:p>
       <w:pPr>
+        <w:ind w:left="432"/>
+      </w:pPr>
+      <w:r>
+        <w:rPr>
+          <w:rFonts w:ascii="Times New Roman" w:hAnsi="Times New Roman" w:eastAsia="宋体"/>
+          <w:b/>
+          <w:i/>
+          <w:color w:val="444444"/>
+          <w:sz w:val="21"/>
+        </w:rPr>
+        <w:t>v2.10（2026-08-30，M2 定理扩展 CS-16）</w:t>
+      </w:r>
+      <w:r>
+        <w:rPr>
+          <w:rFonts w:ascii="Times New Roman" w:hAnsi="Times New Roman" w:eastAsia="宋体"/>
+          <w:b w:val="0"/>
+          <w:i/>
+          <w:color w:val="444444"/>
+          <w:sz w:val="21"/>
+        </w:rPr>
+        <w:t>：</w:t>
+      </w:r>
+      <w:r>
+        <w:rPr>
+          <w:rFonts w:ascii="Times New Roman" w:hAnsi="Times New Roman" w:eastAsia="宋体"/>
+          <w:b/>
+          <w:i/>
+          <w:color w:val="444444"/>
+          <w:sz w:val="21"/>
+        </w:rPr>
+        <w:t>安全域镜像一致性定理侧（CS-16，`probe_safe_domain.v`，纯构造性轨道）</w:t>
+      </w:r>
+      <w:r>
+        <w:rPr>
+          <w:rFonts w:ascii="Times New Roman" w:hAnsi="Times New Roman" w:eastAsia="宋体"/>
+          <w:b w:val="0"/>
+          <w:i/>
+          <w:color w:val="444444"/>
+          <w:sz w:val="21"/>
+        </w:rPr>
+        <w:t xml:space="preserve">——反射检查器提取的 63-bit int 镜像与 Coq 语义的一致性从经验性 FFI 24/24 交叉校验升级为定理保证：乘积上界递推 </w:t>
+      </w:r>
+      <w:r>
+        <w:rPr>
+          <w:rFonts w:ascii="Consolas" w:hAnsi="Consolas" w:eastAsia="等线"/>
+          <w:b w:val="0"/>
+          <w:i w:val="0"/>
+          <w:color w:val="444444"/>
+          <w:sz w:val="19"/>
+        </w:rPr>
+        <w:t>zprod_bounded</w:t>
+      </w:r>
+      <w:r>
+        <w:rPr>
+          <w:rFonts w:ascii="Times New Roman" w:hAnsi="Times New Roman" w:eastAsia="宋体"/>
+          <w:b w:val="0"/>
+          <w:i/>
+          <w:color w:val="444444"/>
+          <w:sz w:val="21"/>
+        </w:rPr>
+        <w:t>（全因子 0 &lt; d ≤ D ⟹ 0 &lt; zprod l ≤ D^length l，非平凡归纳核）判定 C=4 分母链 [400; 2080; 3500; 20800; 33920] 连乘 = 2054520832000000000 &lt; 2^63 落在安全域内（</w:t>
+      </w:r>
+      <w:r>
+        <w:rPr>
+          <w:rFonts w:ascii="Consolas" w:hAnsi="Consolas" w:eastAsia="等线"/>
+          <w:b w:val="0"/>
+          <w:i w:val="0"/>
+          <w:color w:val="444444"/>
+          <w:sz w:val="19"/>
+        </w:rPr>
+        <w:t>c4_safe_domain</w:t>
+      </w:r>
+      <w:r>
+        <w:rPr>
+          <w:rFonts w:ascii="Times New Roman" w:hAnsi="Times New Roman" w:eastAsia="宋体"/>
+          <w:b w:val="0"/>
+          <w:i/>
+          <w:color w:val="444444"/>
+          <w:sz w:val="21"/>
+        </w:rPr>
+        <w:t>），溢出自由蕴含 mod-2^63 镜像与精确语义一致（</w:t>
+      </w:r>
+      <w:r>
+        <w:rPr>
+          <w:rFonts w:ascii="Consolas" w:hAnsi="Consolas" w:eastAsia="等线"/>
+          <w:b w:val="0"/>
+          <w:i w:val="0"/>
+          <w:color w:val="444444"/>
+          <w:sz w:val="19"/>
+        </w:rPr>
+        <w:t>no_overflow_consistent</w:t>
+      </w:r>
+      <w:r>
+        <w:rPr>
+          <w:rFonts w:ascii="Times New Roman" w:hAnsi="Times New Roman" w:eastAsia="宋体"/>
+          <w:b w:val="0"/>
+          <w:i/>
+          <w:color w:val="444444"/>
+          <w:sz w:val="21"/>
+        </w:rPr>
+        <w:t xml:space="preserve">：0 ≤ p &lt; 2^63 ⟹ p mod 2^63 = p），安全域成员资格由可提取 bool 判定 </w:t>
+      </w:r>
+      <w:r>
+        <w:rPr>
+          <w:rFonts w:ascii="Consolas" w:hAnsi="Consolas" w:eastAsia="等线"/>
+          <w:b w:val="0"/>
+          <w:i w:val="0"/>
+          <w:color w:val="444444"/>
+          <w:sz w:val="19"/>
+        </w:rPr>
+        <w:t>safe_domain_bool</w:t>
+      </w:r>
+      <w:r>
+        <w:rPr>
+          <w:rFonts w:ascii="Times New Roman" w:hAnsi="Times New Roman" w:eastAsia="宋体"/>
+          <w:b w:val="0"/>
+          <w:i/>
+          <w:color w:val="444444"/>
+          <w:sz w:val="21"/>
+        </w:rPr>
+        <w:t xml:space="preserve"> 运行时可判定——评审 A1"运行时检查器 int 镜像信任鸿沟"在判定链输入落于安全域时闭合（4 段 Print Assumptions 全 Closed，提取物 safe_domain.ml 经 DkMLNative ocamlc 编译通过；结论区 CS-15 句后同步）。</w:t>
+      </w:r>
+    </w:p>
+    <w:p>
+      <w:pPr>
         <w:pStyle w:val="Heading2"/>
       </w:pPr>
       <w:r>
@@ -1348,7 +1473,115 @@
           <w:i w:val="0"/>
           <w:sz w:val="24"/>
         </w:rPr>
-        <w:t xml:space="preserve">：μ₄·4 = 45156/33920 &gt; 1（全族唯一性窗口关闭，精确障碍）而 μ₄·3 = 33867/33920 &lt; 1（3 原子子族窗口开启）——同一常数 μ₄ = 11289/33920 的两个方向判定（`c4_four_atom_layered_certificate` 合成）。τ/碰撞机制累计 </w:t>
+        <w:t>：μ₄·4 = 45156/33920 &gt; 1（全族唯一性窗口关闭，精确障碍）而 μ₄·3 = 33867/33920 &lt; 1（3 原子子族窗口开启）——同一常数 μ₄ = 11289/33920 的两个方向判定（`c4_four_atom_layered_certificate` 合成）。</w:t>
+      </w:r>
+      <w:r>
+        <w:rPr>
+          <w:rFonts w:ascii="Times New Roman" w:hAnsi="Times New Roman" w:eastAsia="宋体"/>
+          <w:b w:val="0"/>
+          <w:i w:val="0"/>
+          <w:sz w:val="24"/>
+        </w:rPr>
+        <w:t>安全域镜像一致性定理侧（CS-16，</w:t>
+      </w:r>
+      <w:r>
+        <w:rPr>
+          <w:rFonts w:ascii="Consolas" w:hAnsi="Consolas" w:eastAsia="等线"/>
+          <w:b w:val="0"/>
+          <w:i w:val="0"/>
+          <w:sz w:val="22"/>
+        </w:rPr>
+        <w:t>probe_safe_domain.v</w:t>
+      </w:r>
+      <w:r>
+        <w:rPr>
+          <w:rFonts w:ascii="Times New Roman" w:hAnsi="Times New Roman" w:eastAsia="宋体"/>
+          <w:b w:val="0"/>
+          <w:i w:val="0"/>
+          <w:sz w:val="24"/>
+        </w:rPr>
+        <w:t>，2026-08-30，纯构造性轨道：nat/Z 层、Set 层可计算 Fixpoint（zprod）、零经典公理、4 段 Print Assumptions 全 Closed、提取物 safe_domain.ml 经 DkMLNative ocamlc 编译通过）</w:t>
+      </w:r>
+      <w:r>
+        <w:rPr>
+          <w:rFonts w:ascii="Times New Roman" w:hAnsi="Times New Roman" w:eastAsia="宋体"/>
+          <w:b/>
+          <w:i w:val="0"/>
+          <w:sz w:val="24"/>
+        </w:rPr>
+        <w:t>：反射检查器提取的 63-bit int 镜像与 Coq 语义的一致性由此从经验性 FFI 24/24 交叉校验升级为定理保证——</w:t>
+      </w:r>
+      <w:r>
+        <w:rPr>
+          <w:rFonts w:ascii="Times New Roman" w:hAnsi="Times New Roman" w:eastAsia="宋体"/>
+          <w:b w:val="0"/>
+          <w:i w:val="0"/>
+          <w:sz w:val="24"/>
+        </w:rPr>
+        <w:t>乘积上界递推（</w:t>
+      </w:r>
+      <w:r>
+        <w:rPr>
+          <w:rFonts w:ascii="Consolas" w:hAnsi="Consolas" w:eastAsia="等线"/>
+          <w:b w:val="0"/>
+          <w:i w:val="0"/>
+          <w:sz w:val="22"/>
+        </w:rPr>
+        <w:t>zprod_bounded</w:t>
+      </w:r>
+      <w:r>
+        <w:rPr>
+          <w:rFonts w:ascii="Times New Roman" w:hAnsi="Times New Roman" w:eastAsia="宋体"/>
+          <w:b w:val="0"/>
+          <w:i w:val="0"/>
+          <w:sz w:val="24"/>
+        </w:rPr>
+        <w:t>，非平凡归纳核）</w:t>
+      </w:r>
+      <w:r>
+        <w:rPr>
+          <w:rFonts w:ascii="Times New Roman" w:hAnsi="Times New Roman" w:eastAsia="宋体"/>
+          <w:b/>
+          <w:i w:val="0"/>
+          <w:sz w:val="24"/>
+        </w:rPr>
+        <w:t>：全因子 0 &lt; d ≤ D ⟹ 0 &lt; zprod l ≤ D^length l，据此判定 C=4 分母链 [400; 2080; 3500; 20800; 33920] 落在安全域内：连乘 = 2054520832000000000 &lt; 2^63（`c4_safe_domain`）；</w:t>
+      </w:r>
+      <w:r>
+        <w:rPr>
+          <w:rFonts w:ascii="Times New Roman" w:hAnsi="Times New Roman" w:eastAsia="宋体"/>
+          <w:b w:val="0"/>
+          <w:i w:val="0"/>
+          <w:sz w:val="24"/>
+        </w:rPr>
+        <w:t>溢出自由一致性（</w:t>
+      </w:r>
+      <w:r>
+        <w:rPr>
+          <w:rFonts w:ascii="Consolas" w:hAnsi="Consolas" w:eastAsia="等线"/>
+          <w:b w:val="0"/>
+          <w:i w:val="0"/>
+          <w:sz w:val="22"/>
+        </w:rPr>
+        <w:t>no_overflow_consistent</w:t>
+      </w:r>
+      <w:r>
+        <w:rPr>
+          <w:rFonts w:ascii="Times New Roman" w:hAnsi="Times New Roman" w:eastAsia="宋体"/>
+          <w:b w:val="0"/>
+          <w:i w:val="0"/>
+          <w:sz w:val="24"/>
+        </w:rPr>
+        <w:t>）</w:t>
+      </w:r>
+      <w:r>
+        <w:rPr>
+          <w:rFonts w:ascii="Times New Roman" w:hAnsi="Times New Roman" w:eastAsia="宋体"/>
+          <w:b/>
+          <w:i w:val="0"/>
+          <w:sz w:val="24"/>
+        </w:rPr>
+        <w:t xml:space="preserve">：0 ≤ p &lt; 2^63 ⟹ p mod 2^63 = p；安全域成员资格由可提取 bool 判定 `safe_domain_bool` 运行时可判定——评审 A1"运行时检查器 int 镜像信任鸿沟"在判定链输入落于安全域时闭合。τ/碰撞机制累计 </w:t>
       </w:r>
       <w:r>
         <w:rPr>

</xml_diff>

<commit_message>
M2 fourth theorem: CS-18 A-B bridge pier (psi kernel drift + truncation TVD)
probe_ab_bridge_pier.v: psi_kernel_drift_bound — adjacent-position drift of
the psi kernel bounded by 2/(sqrt n * sqrt m) (triangle route, venue-prototype
theorem); psi_attention_tvd_trunc — window truncation dc = INR(W-W')*(1/2)
(bands >= 2 uniformization) instantiated through PhaseCoherence's
kernel_drift_controls_attention to yield softmax TVD <= exp(2*dc*dd) - 1.
Upgrades the 'no formalized bridge' caveat into a machine-checked pier; the
end-to-end PPL deck remains empirical, as stated. Audit: Dedekind-two + fext
(mainline footprint), classic zero, zero Admitted; R-layer theorems are not
extractable, noted honestly. Paper B v2.12: CS-18 sentence after CS-17
(master revision note + formal version, both docx regenerated).
</commit_message>
<xml_diff>
--- a/papers/论文B中文规范版-PhaseCompleteLadders.docx
+++ b/papers/论文B中文规范版-PhaseCompleteLadders.docx
@@ -59,7 +59,7 @@
           <w:color w:val="444444"/>
           <w:sz w:val="21"/>
         </w:rPr>
-        <w:t xml:space="preserve">版本：最终版 v2.11（2026-08-30）｜数据基线：2026-08-21 全量实证终态 + 2026-08-22 网格/τ 三剪判决（3 个种子确认 + E1 全部消融 + τ 机制 5 个正向判决）+ 2026-08-23 正式配置复现（tinystories200 · 27000 iters，云端 T4，τ 裁剪 τ-trimmed reallocation，τ 机制 7 个方向性正向判决 = 3 稳健支点 + 1 候选[v2.9 降格]）+ </w:t>
+        <w:t xml:space="preserve">版本：最终版 v2.12（2026-08-30）｜数据基线：2026-08-21 全量实证终态 + 2026-08-22 网格/τ 三剪判决（3 个种子确认 + E1 全部消融 + τ 机制 5 个正向判决）+ 2026-08-23 正式配置复现（tinystories200 · 27000 iters，云端 T4，τ 裁剪 τ-trimmed reallocation，τ 机制 7 个方向性正向判决 = 3 稳健支点 + 1 候选[v2.9 降格]）+ </w:t>
       </w:r>
       <w:r>
         <w:rPr>
@@ -1199,6 +1199,171 @@
     </w:p>
     <w:p>
       <w:pPr>
+        <w:ind w:left="432"/>
+      </w:pPr>
+      <w:r>
+        <w:rPr>
+          <w:rFonts w:ascii="Times New Roman" w:hAnsi="Times New Roman" w:eastAsia="宋体"/>
+          <w:b/>
+          <w:i/>
+          <w:color w:val="444444"/>
+          <w:sz w:val="21"/>
+        </w:rPr>
+        <w:t>v2.12（2026-08-30，M2 定理扩展 CS-18）</w:t>
+      </w:r>
+      <w:r>
+        <w:rPr>
+          <w:rFonts w:ascii="Times New Roman" w:hAnsi="Times New Roman" w:eastAsia="宋体"/>
+          <w:b w:val="0"/>
+          <w:i/>
+          <w:color w:val="444444"/>
+          <w:sz w:val="21"/>
+        </w:rPr>
+        <w:t>：</w:t>
+      </w:r>
+      <w:r>
+        <w:rPr>
+          <w:rFonts w:ascii="Times New Roman" w:hAnsi="Times New Roman" w:eastAsia="宋体"/>
+          <w:b/>
+          <w:i/>
+          <w:color w:val="444444"/>
+          <w:sz w:val="21"/>
+        </w:rPr>
+        <w:t>A-B 桥梁桥墩定理侧（CS-18，`probe_ab_bridge_pier.v`，经典 R 轨道）</w:t>
+      </w:r>
+      <w:r>
+        <w:rPr>
+          <w:rFonts w:ascii="Times New Roman" w:hAnsi="Times New Roman" w:eastAsia="宋体"/>
+          <w:b w:val="0"/>
+          <w:i/>
+          <w:color w:val="444444"/>
+          <w:sz w:val="21"/>
+        </w:rPr>
+        <w:t xml:space="preserve">——「无形式化桥梁」负面声明升级为「中间桥墩已机器检查」：psi 核（逐位内积被加项 </w:t>
+      </w:r>
+      <w:r>
+        <w:rPr>
+          <w:rFonts w:ascii="Consolas" w:hAnsi="Consolas" w:eastAsia="等线"/>
+          <w:b w:val="0"/>
+          <w:i w:val="0"/>
+          <w:color w:val="444444"/>
+          <w:sz w:val="19"/>
+        </w:rPr>
+        <w:t>psi_kernel n m k := re (psi n k *c Cconj (psi m k))</w:t>
+      </w:r>
+      <w:r>
+        <w:rPr>
+          <w:rFonts w:ascii="Times New Roman" w:hAnsi="Times New Roman" w:eastAsia="宋体"/>
+          <w:b w:val="0"/>
+          <w:i/>
+          <w:color w:val="444444"/>
+          <w:sz w:val="21"/>
+        </w:rPr>
+        <w:t>）的</w:t>
+      </w:r>
+      <w:r>
+        <w:rPr>
+          <w:rFonts w:ascii="Times New Roman" w:hAnsi="Times New Roman" w:eastAsia="宋体"/>
+          <w:b/>
+          <w:i/>
+          <w:color w:val="444444"/>
+          <w:sz w:val="21"/>
+        </w:rPr>
+        <w:t>相邻位漂移界</w:t>
+      </w:r>
+      <w:r>
+        <w:rPr>
+          <w:rFonts w:ascii="Times New Roman" w:hAnsi="Times New Roman" w:eastAsia="宋体"/>
+          <w:b w:val="0"/>
+          <w:i/>
+          <w:color w:val="444444"/>
+          <w:sz w:val="21"/>
+        </w:rPr>
+        <w:t xml:space="preserve"> </w:t>
+      </w:r>
+      <w:r>
+        <w:rPr>
+          <w:rFonts w:ascii="Consolas" w:hAnsi="Consolas" w:eastAsia="等线"/>
+          <w:b w:val="0"/>
+          <w:i w:val="0"/>
+          <w:color w:val="444444"/>
+          <w:sz w:val="19"/>
+        </w:rPr>
+        <w:t>psi_kernel_drift_bound</w:t>
+      </w:r>
+      <w:r>
+        <w:rPr>
+          <w:rFonts w:ascii="Times New Roman" w:hAnsi="Times New Roman" w:eastAsia="宋体"/>
+          <w:b w:val="0"/>
+          <w:i/>
+          <w:color w:val="444444"/>
+          <w:sz w:val="21"/>
+        </w:rPr>
+        <w:t>：|psi_kernel n m k − psi_kernel n m (S k)| ≤ 2/(√n·√m)（三角不等式路线，venue 原型定理）；</w:t>
+      </w:r>
+      <w:r>
+        <w:rPr>
+          <w:rFonts w:ascii="Times New Roman" w:hAnsi="Times New Roman" w:eastAsia="宋体"/>
+          <w:b/>
+          <w:i/>
+          <w:color w:val="444444"/>
+          <w:sz w:val="21"/>
+        </w:rPr>
+        <w:t>截断 TVD 桥</w:t>
+      </w:r>
+      <w:r>
+        <w:rPr>
+          <w:rFonts w:ascii="Times New Roman" w:hAnsi="Times New Roman" w:eastAsia="宋体"/>
+          <w:b w:val="0"/>
+          <w:i/>
+          <w:color w:val="444444"/>
+          <w:sz w:val="21"/>
+        </w:rPr>
+        <w:t xml:space="preserve"> </w:t>
+      </w:r>
+      <w:r>
+        <w:rPr>
+          <w:rFonts w:ascii="Consolas" w:hAnsi="Consolas" w:eastAsia="等线"/>
+          <w:b w:val="0"/>
+          <w:i w:val="0"/>
+          <w:color w:val="444444"/>
+          <w:sz w:val="19"/>
+        </w:rPr>
+        <w:t>psi_attention_tvd_trunc</w:t>
+      </w:r>
+      <w:r>
+        <w:rPr>
+          <w:rFonts w:ascii="Times New Roman" w:hAnsi="Times New Roman" w:eastAsia="宋体"/>
+          <w:b w:val="0"/>
+          <w:i/>
+          <w:color w:val="444444"/>
+          <w:sz w:val="21"/>
+        </w:rPr>
+        <w:t xml:space="preserve">：基核窗口从 W 截至 W' 时 |K i j − K' i j| ≤ INR(W−W')·(1/(√v_i·√v_j)) ≤ INR(W−W')·(1/2)（带 ≥2 一致化），实例化 PhaseCoherence 的 </w:t>
+      </w:r>
+      <w:r>
+        <w:rPr>
+          <w:rFonts w:ascii="Consolas" w:hAnsi="Consolas" w:eastAsia="等线"/>
+          <w:b w:val="0"/>
+          <w:i w:val="0"/>
+          <w:color w:val="444444"/>
+          <w:sz w:val="19"/>
+        </w:rPr>
+        <w:t>kernel_drift_controls_attention</w:t>
+      </w:r>
+      <w:r>
+        <w:rPr>
+          <w:rFonts w:ascii="Times New Roman" w:hAnsi="Times New Roman" w:eastAsia="宋体"/>
+          <w:b w:val="0"/>
+          <w:i/>
+          <w:color w:val="444444"/>
+          <w:sz w:val="21"/>
+        </w:rPr>
+        <w:t>（核漂移 dc ⟹ softmax TVD ≤ exp(2·dc·dd) − 1）得 TVD ≤ exp(2·(INR(W−W')·(1/2))·dd) − 1（dd = Σ|c_j|）——桥墩已建、桥面（端到端 PPL）如实仍为实证轨道。零 Admitted、审计脚印 = Dedekind 二件 + fext 与主线 165 基线同源、classic 零出现；R 层定理（sqrt/softmax）不可提取，如实注明。结论区 CS-17 句后同步。</w:t>
+      </w:r>
+    </w:p>
+    <w:p>
+      <w:pPr>
         <w:pStyle w:val="Heading2"/>
       </w:pPr>
       <w:r>
@@ -1772,7 +1937,97 @@
           <w:i w:val="0"/>
           <w:sz w:val="24"/>
         </w:rPr>
-        <w:t xml:space="preserve">、[2,3]→L3、乱序/空→L4（vm_compute 逐例判定），决策函数 nat 可提取（psa_guard 侧分级入口）——回应四轮评审共同攻击点"检查器太二元"。τ/碰撞机制累计 </w:t>
+        <w:t>、[2,3]→L3、乱序/空→L4（vm_compute 逐例判定），决策函数 nat 可提取（psa_guard 侧分级入口）——回应四轮评审共同攻击点"检查器太二元"。</w:t>
+      </w:r>
+      <w:r>
+        <w:rPr>
+          <w:rFonts w:ascii="Times New Roman" w:hAnsi="Times New Roman" w:eastAsia="宋体"/>
+          <w:b w:val="0"/>
+          <w:i w:val="0"/>
+          <w:sz w:val="24"/>
+        </w:rPr>
+        <w:t>A-B 桥梁桥墩定理侧（CS-18，</w:t>
+      </w:r>
+      <w:r>
+        <w:rPr>
+          <w:rFonts w:ascii="Consolas" w:hAnsi="Consolas" w:eastAsia="等线"/>
+          <w:b w:val="0"/>
+          <w:i w:val="0"/>
+          <w:sz w:val="22"/>
+        </w:rPr>
+        <w:t>probe_ab_bridge_pier.v</w:t>
+      </w:r>
+      <w:r>
+        <w:rPr>
+          <w:rFonts w:ascii="Times New Roman" w:hAnsi="Times New Roman" w:eastAsia="宋体"/>
+          <w:b w:val="0"/>
+          <w:i w:val="0"/>
+          <w:sz w:val="24"/>
+        </w:rPr>
+        <w:t>，2026-08-30，经典 R 轨道：零 Admitted、审计脚印 = Dedekind 二件 + fext 与主线 165 基线同源、classic 零出现；R 层定理（sqrt/softmax）不可提取，如实注明）</w:t>
+      </w:r>
+      <w:r>
+        <w:rPr>
+          <w:rFonts w:ascii="Times New Roman" w:hAnsi="Times New Roman" w:eastAsia="宋体"/>
+          <w:b/>
+          <w:i w:val="0"/>
+          <w:sz w:val="24"/>
+        </w:rPr>
+        <w:t>：论文 A 证书（基表示层能量稳定）与论文 B 端到端性能（PPL 实证）的衔接由此获得第一个机器检查的中间桥墩——psi 核（逐位内积被加项 `psi_kernel n m k := re (psi n k *c Cconj (psi m k))`）的</w:t>
+      </w:r>
+      <w:r>
+        <w:rPr>
+          <w:rFonts w:ascii="Times New Roman" w:hAnsi="Times New Roman" w:eastAsia="宋体"/>
+          <w:b w:val="0"/>
+          <w:i w:val="0"/>
+          <w:sz w:val="24"/>
+        </w:rPr>
+        <w:t>相邻位漂移界</w:t>
+      </w:r>
+      <w:r>
+        <w:rPr>
+          <w:rFonts w:ascii="Times New Roman" w:hAnsi="Times New Roman" w:eastAsia="宋体"/>
+          <w:b/>
+          <w:i w:val="0"/>
+          <w:sz w:val="24"/>
+        </w:rPr>
+        <w:t xml:space="preserve"> `psi_kernel_drift_bound`：|psi_kernel n m k − psi_kernel n m (S k)| ≤ 2/(√n·√m)（三角不等式路线）；</w:t>
+      </w:r>
+      <w:r>
+        <w:rPr>
+          <w:rFonts w:ascii="Times New Roman" w:hAnsi="Times New Roman" w:eastAsia="宋体"/>
+          <w:b w:val="0"/>
+          <w:i w:val="0"/>
+          <w:sz w:val="24"/>
+        </w:rPr>
+        <w:t>截断 TVD 桥</w:t>
+      </w:r>
+      <w:r>
+        <w:rPr>
+          <w:rFonts w:ascii="Times New Roman" w:hAnsi="Times New Roman" w:eastAsia="宋体"/>
+          <w:b/>
+          <w:i w:val="0"/>
+          <w:sz w:val="24"/>
+        </w:rPr>
+        <w:t xml:space="preserve"> `psi_attention_tvd_trunc`：基核求和窗口从 W 截至 W' 时 |K i j − K' i j| ≤ INR(W−W')·(1/(√v_i·√v_j)) ≤ INR(W−W')·(1/2)（带 ≥2 一致化），实例化框架 PhaseCoherence 的 `kernel_drift_controls_attention`（核漂移 dc ⟹ softmax 输出 TVD ≤ exp(2·dc·dd) − 1）得 </w:t>
+      </w:r>
+      <w:r>
+        <w:rPr>
+          <w:rFonts w:ascii="Times New Roman" w:hAnsi="Times New Roman" w:eastAsia="宋体"/>
+          <w:b w:val="0"/>
+          <w:i w:val="0"/>
+          <w:sz w:val="24"/>
+        </w:rPr>
+        <w:t>TVD ≤ exp(2·(INR(W−W')·(1/2))·dd) − 1</w:t>
+      </w:r>
+      <w:r>
+        <w:rPr>
+          <w:rFonts w:ascii="Times New Roman" w:hAnsi="Times New Roman" w:eastAsia="宋体"/>
+          <w:b/>
+          <w:i w:val="0"/>
+          <w:sz w:val="24"/>
+        </w:rPr>
+        <w:t xml:space="preserve">（dd = Σ|c_j|）——桥墩已建、桥面（端到端 PPL 影响量化）如实仍为实证轨道（未来工作）。 τ/碰撞机制累计 </w:t>
       </w:r>
       <w:r>
         <w:rPr>

</xml_diff>

<commit_message>
B standard version: v2.16 stack entry (z3b sufficiency linkage) in native format
</commit_message>
<xml_diff>
--- a/papers/论文B中文规范版-PhaseCompleteLadders.docx
+++ b/papers/论文B中文规范版-PhaseCompleteLadders.docx
@@ -67,6 +67,205 @@
           <w:rFonts w:hint="eastAsia"/>
         </w:rPr>
         <w:t xml:space="preserve">v2.16（2026-09-02）｜</w:t>
+      </w:r>
+      <w:r>
+        <w:t xml:space="preserve"> </w:t>
+      </w:r>
+      <w:r>
+        <w:rPr>
+          <w:rFonts w:hint="eastAsia"/>
+          <w:b/>
+          <w:bCs/>
+        </w:rPr>
+        <w:t xml:space="preserve">v2.16（2026-09-02，#3b</w:t>
+      </w:r>
+      <w:r>
+        <w:rPr>
+          <w:b/>
+          <w:bCs/>
+        </w:rPr>
+        <w:t xml:space="preserve"> z3b </w:t>
+      </w:r>
+      <w:r>
+        <w:rPr>
+          <w:rFonts w:hint="eastAsia"/>
+          <w:b/>
+          <w:bCs/>
+        </w:rPr>
+        <w:t xml:space="preserve">充分性定理联动）</w:t>
+      </w:r>
+      <w:r>
+        <w:rPr>
+          <w:rFonts w:hint="eastAsia"/>
+        </w:rPr>
+        <w:t xml:space="preserve">：z3b_sufficiency（合并版分区</w:t>
+      </w:r>
+      <w:r>
+        <w:t xml:space="preserve"> </w:t>
+      </w:r>
+      <w:r>
+        <w:rPr>
+          <w:rFonts w:hint="eastAsia"/>
+        </w:rPr>
+        <w:t xml:space="preserve">77，</w:t>
+      </w:r>
+      <w:r>
+        <w:rPr>
+          <w:rStyle w:val="VerbatimChar"/>
+        </w:rPr>
+        <w:t xml:space="preserve">probe_z3b_validregion.v</w:t>
+      </w:r>
+      <w:r>
+        <w:t xml:space="preserve"> </w:t>
+      </w:r>
+      <w:r>
+        <w:t xml:space="preserve">2314 </w:t>
+      </w:r>
+      <w:r>
+        <w:rPr>
+          <w:rFonts w:hint="eastAsia"/>
+        </w:rPr>
+        <w:t xml:space="preserve">行</w:t>
+      </w:r>
+      <w:r>
+        <w:t xml:space="preserve"> 5 </w:t>
+      </w:r>
+      <w:r>
+        <w:rPr>
+          <w:rFonts w:hint="eastAsia"/>
+        </w:rPr>
+        <w:t xml:space="preserve">段</w:t>
+      </w:r>
+      <w:r>
+        <w:t xml:space="preserve"> Print Assumptions </w:t>
+      </w:r>
+      <w:r>
+        <w:rPr>
+          <w:rFonts w:hint="eastAsia"/>
+        </w:rPr>
+        <w:t xml:space="preserve">全</w:t>
+      </w:r>
+      <w:r>
+        <w:t xml:space="preserve"> </w:t>
+      </w:r>
+      <w:r>
+        <w:rPr>
+          <w:rFonts w:hint="eastAsia"/>
+        </w:rPr>
+        <w:t xml:space="preserve">Closed）：q=8</w:t>
+      </w:r>
+      <w:r>
+        <w:t xml:space="preserve"> </w:t>
+      </w:r>
+      <w:r>
+        <w:rPr>
+          <w:rFonts w:hint="eastAsia"/>
+        </w:rPr>
+        <w:t xml:space="preserve">几何阶梯（n0≥2、任意</w:t>
+      </w:r>
+      <w:r>
+        <w:t xml:space="preserve"> </w:t>
+      </w:r>
+      <w:r>
+        <w:rPr>
+          <w:rFonts w:hint="eastAsia"/>
+        </w:rPr>
+        <w:t xml:space="preserve">m≥1）</w:t>
+      </w:r>
+      <w:r>
+        <w:rPr>
+          <w:rFonts w:hint="eastAsia"/>
+          <w:b/>
+          <w:bCs/>
+        </w:rPr>
+        <w:t xml:space="preserve">无条件通过</w:t>
+      </w:r>
+      <w:r>
+        <w:t xml:space="preserve"> </w:t>
+      </w:r>
+      <w:r>
+        <w:rPr>
+          <w:rFonts w:hint="eastAsia"/>
+        </w:rPr>
+        <w:t xml:space="preserve">frame_check_instance——检查器充分性方向的构造性定理；几何阶梯假阴性由此限定于显式比率带</w:t>
+      </w:r>
+      <w:r>
+        <w:t xml:space="preserve"> [c, </w:t>
+      </w:r>
+      <w:r>
+        <w:rPr>
+          <w:rFonts w:hint="eastAsia"/>
+        </w:rPr>
+        <w:t xml:space="preserve">8)（与论文</w:t>
+      </w:r>
+      <w:r>
+        <w:t xml:space="preserve"> A pareto_law_main </w:t>
+      </w:r>
+      <w:r>
+        <w:rPr>
+          <w:rFonts w:hint="eastAsia"/>
+        </w:rPr>
+        <w:t xml:space="preserve">合成）；提取</w:t>
+      </w:r>
+      <w:r>
+        <w:t xml:space="preserve"> </w:t>
+      </w:r>
+      <w:r>
+        <w:rPr>
+          <w:rStyle w:val="VerbatimChar"/>
+        </w:rPr>
+        <w:t xml:space="preserve">z3b_bench.ml</w:t>
+      </w:r>
+      <w:r>
+        <w:rPr>
+          <w:rFonts w:hint="eastAsia"/>
+        </w:rPr>
+        <w:t xml:space="preserve">（WSL</w:t>
+      </w:r>
+      <w:r>
+        <w:t xml:space="preserve"> </w:t>
+      </w:r>
+      <w:r>
+        <w:rPr>
+          <w:rFonts w:hint="eastAsia"/>
+        </w:rPr>
+        <w:t xml:space="preserve">ocamlopt：[2,16,128]=true</w:t>
+      </w:r>
+      <w:r>
+        <w:t xml:space="preserve"> </w:t>
+      </w:r>
+      <w:r>
+        <w:rPr>
+          <w:rFonts w:hint="eastAsia"/>
+        </w:rPr>
+        <w:t xml:space="preserve">机器实证、[2,3]</w:t>
+      </w:r>
+      <w:r>
+        <w:t xml:space="preserve"> </w:t>
+      </w:r>
+      <w:r>
+        <w:rPr>
+          <w:rFonts w:hint="eastAsia"/>
+        </w:rPr>
+        <w:t xml:space="preserve">反例</w:t>
+      </w:r>
+      <w:r>
+        <w:t xml:space="preserve"> </w:t>
+      </w:r>
+      <w:r>
+        <w:rPr>
+          <w:rFonts w:hint="eastAsia"/>
+        </w:rPr>
+        <w:t xml:space="preserve">false）；口径刷新</w:t>
+      </w:r>
+      <w:r>
+        <w:t xml:space="preserve"> </w:t>
+      </w:r>
+      <w:r>
+        <w:rPr>
+          <w:rFonts w:hint="eastAsia"/>
+        </w:rPr>
+        <w:t xml:space="preserve">95848/76→98187/77。数据基线不变。</w:t>
       </w:r>
       <w:r>
         <w:t xml:space="preserve"> </w:t>

</xml_diff>